<commit_message>
refactor: update resume link to .docx format and remove redundant .pdf file
</commit_message>
<xml_diff>
--- a/resume-dva.docx
+++ b/resume-dva.docx
@@ -62,7 +62,13 @@
       </w:r>
       <w:hyperlink r:id="rId8">
         <w:r>
-          <w:t>Tableau</w:t>
+          <w:t>Ta</w:t>
+        </w:r>
+        <w:r>
+          <w:t>b</w:t>
+        </w:r>
+        <w:r>
+          <w:t>leau</w:t>
         </w:r>
       </w:hyperlink>
     </w:p>
@@ -273,7 +279,7 @@
           </mc:Choice>
           <mc:Fallback>
             <w:pict>
-              <v:group w14:anchorId="5B6E296D" id="Group 1257" o:spid="_x0000_s1026" style="width:554.4pt;height:.4pt;mso-position-horizontal-relative:char;mso-position-vertical-relative:line" coordsize="70408,50" o:gfxdata="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">
+              <v:group w14:anchorId="2E634C4A" id="Group 1257" o:spid="_x0000_s1026" style="width:554.4pt;height:.4pt;mso-position-horizontal-relative:char;mso-position-vertical-relative:line" coordsize="70408,50" o:gfxdata="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">
                 <v:shape id="Shape 24" o:spid="_x0000_s1027" style="position:absolute;width:70408;height:0;visibility:visible;mso-wrap-style:square;v-text-anchor:top" coordsize="7040893,0" o:gfxdata="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" path="m,l7040893,e" filled="f" strokeweight=".14042mm">
                   <v:stroke miterlimit="83231f" joinstyle="miter"/>
                   <v:path arrowok="t" textboxrect="0,0,7040893,0"/>
@@ -327,7 +333,13 @@
       </w:r>
       <w:r>
         <w:tab/>
-        <w:t>Grade: 7.8/10.0</w:t>
+        <w:t>Grade: 7.</w:t>
+      </w:r>
+      <w:r>
+        <w:t>5</w:t>
+      </w:r>
+      <w:r>
+        <w:t>/10.0</w:t>
       </w:r>
     </w:p>
     <w:p>
@@ -483,7 +495,7 @@
           </mc:Choice>
           <mc:Fallback>
             <w:pict>
-              <v:group w14:anchorId="108BD6D6" id="Group 1258" o:spid="_x0000_s1026" style="width:554.4pt;height:.4pt;mso-position-horizontal-relative:char;mso-position-vertical-relative:line" coordsize="70408,50" o:gfxdata="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">
+              <v:group w14:anchorId="51790D2C" id="Group 1258" o:spid="_x0000_s1026" style="width:554.4pt;height:.4pt;mso-position-horizontal-relative:char;mso-position-vertical-relative:line" coordsize="70408,50" o:gfxdata="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">
                 <v:shape id="Shape 37" o:spid="_x0000_s1027" style="position:absolute;width:70408;height:0;visibility:visible;mso-wrap-style:square;v-text-anchor:top" coordsize="7040893,0" o:gfxdata="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" path="m,l7040893,e" filled="f" strokeweight=".14042mm">
                   <v:stroke miterlimit="83231f" joinstyle="miter"/>
                   <v:path arrowok="t" textboxrect="0,0,7040893,0"/>
@@ -734,7 +746,7 @@
           </mc:Choice>
           <mc:Fallback>
             <w:pict>
-              <v:group w14:anchorId="7232C6EE" id="Group 1261" o:spid="_x0000_s1026" style="position:absolute;margin-left:28.8pt;margin-top:759.85pt;width:554.4pt;height:.4pt;z-index:251660288;mso-position-horizontal-relative:page;mso-position-vertical-relative:page" coordsize="70408,50" o:gfxdata="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">
+              <v:group w14:anchorId="573E798F" id="Group 1261" o:spid="_x0000_s1026" style="position:absolute;margin-left:28.8pt;margin-top:759.85pt;width:554.4pt;height:.4pt;z-index:251660288;mso-position-horizontal-relative:page;mso-position-vertical-relative:page" coordsize="70408,50" o:gfxdata="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">
                 <v:shape id="Shape 110" o:spid="_x0000_s1027" style="position:absolute;width:70408;height:0;visibility:visible;mso-wrap-style:square;v-text-anchor:top" coordsize="7040893,0" o:gfxdata="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" path="m,l7040893,e" filled="f" strokeweight=".14042mm">
                   <v:stroke miterlimit="83231f" joinstyle="miter"/>
                   <v:path arrowok="t" textboxrect="0,0,7040893,0"/>

</xml_diff>